<commit_message>
docs(entrega): el documento tecnico tenia media pagina en blanco a la mitad
Un salto de pagina antes de la seccion de Flows partia el documento y dejaba la pagina 3
llena a un tercio. Se quita y pasa de seis paginas a cinco, todas completas. Revisadas
las quince paginas de los tres documentos una por una: ninguna queda vacia, cortada ni
con un valor sin resolver.

Co-Authored-By: Claude Opus 5 <noreply@anthropic.com>
</commit_message>
<xml_diff>
--- a/torre-agentforce/entrega/Documento_Tecnico_Equipo35_Agente_Postventa_Zapata.docx
+++ b/torre-agentforce/entrega/Documento_Tecnico_Equipo35_Agente_Postventa_Zapata.docx
@@ -1408,11 +1408,6 @@
           <w:szCs w:val="20"/>
         </w:rPr>
         <w:t xml:space="preserve">Su trabajo es no actuar. Off-topic declina lo ajeno a postventa de camiones —incluidas compra de unidades, financiamiento, seguros y recursos humanos— y ofrece un asesor. Ambiguous_question pide la precisión mínima con opciones concretas. Sin estos dos, un agente que escala cualquier mensaje vago o que opina fuera de su alcance hace daño silencioso que ninguna prueba de registros creados detecta.</w:t>
-      </w:r>
-    </w:p>
-    <w:p>
-      <w:r>
-        <w:br w:type="page"/>
       </w:r>
     </w:p>
     <w:p>

</xml_diff>